<commit_message>
admin log + fix bugs +  analys
</commit_message>
<xml_diff>
--- a/lab/exports/main_log_sheet_1405-02-014.docx
+++ b/lab/exports/main_log_sheet_1405-02-014.docx
@@ -745,7 +745,7 @@
                 <w:sz w:val="16"/>
                 <w:szCs w:val="16"/>
               </w:rPr>
-              <w:t xml:space="preserve">1</w:t>
+              <w:t xml:space="preserve">23</w:t>
             </w:r>
           </w:p>
         </w:tc>
@@ -888,7 +888,7 @@
                 <w:sz w:val="16"/>
                 <w:szCs w:val="16"/>
               </w:rPr>
-              <w:t xml:space="preserve">23</w:t>
+              <w:t xml:space="preserve">22</w:t>
             </w:r>
           </w:p>
         </w:tc>
@@ -1031,7 +1031,7 @@
                 <w:sz w:val="16"/>
                 <w:szCs w:val="16"/>
               </w:rPr>
-              <w:t xml:space="preserve">23</w:t>
+              <w:t xml:space="preserve">22</w:t>
             </w:r>
           </w:p>
         </w:tc>
@@ -1317,7 +1317,7 @@
                 <w:sz w:val="16"/>
                 <w:szCs w:val="16"/>
               </w:rPr>
-              <w:t xml:space="preserve">121</w:t>
+              <w:t xml:space="preserve">22</w:t>
             </w:r>
           </w:p>
         </w:tc>
@@ -1460,7 +1460,7 @@
                 <w:sz w:val="16"/>
                 <w:szCs w:val="16"/>
               </w:rPr>
-              <w:t xml:space="preserve">121</w:t>
+              <w:t xml:space="preserve">1</w:t>
             </w:r>
           </w:p>
         </w:tc>
@@ -1603,7 +1603,7 @@
                 <w:sz w:val="16"/>
                 <w:szCs w:val="16"/>
               </w:rPr>
-              <w:t xml:space="preserve">11</w:t>
+              <w:t xml:space="preserve">1</w:t>
             </w:r>
           </w:p>
         </w:tc>
@@ -1746,7 +1746,7 @@
                 <w:sz w:val="16"/>
                 <w:szCs w:val="16"/>
               </w:rPr>
-              <w:t xml:space="preserve">1</w:t>
+              <w:t xml:space="preserve">2</w:t>
             </w:r>
           </w:p>
         </w:tc>
@@ -1889,7 +1889,7 @@
                 <w:sz w:val="16"/>
                 <w:szCs w:val="16"/>
               </w:rPr>
-              <w:t xml:space="preserve">11</w:t>
+              <w:t xml:space="preserve">21</w:t>
             </w:r>
           </w:p>
         </w:tc>
@@ -2032,7 +2032,7 @@
                 <w:sz w:val="16"/>
                 <w:szCs w:val="16"/>
               </w:rPr>
-              <w:t xml:space="preserve">123</w:t>
+              <w:t xml:space="preserve">31</w:t>
             </w:r>
           </w:p>
         </w:tc>
@@ -2175,7 +2175,7 @@
                 <w:sz w:val="16"/>
                 <w:szCs w:val="16"/>
               </w:rPr>
-              <w:t xml:space="preserve">123</w:t>
+              <w:t xml:space="preserve">44</w:t>
             </w:r>
           </w:p>
         </w:tc>
@@ -2499,7 +2499,7 @@
           <w:sz w:val="18"/>
           <w:szCs w:val="18"/>
         </w:rPr>
-        <w:t xml:space="preserve">تاریخ گزارش: 2026/09/16</w:t>
+        <w:t xml:space="preserve">تاریخ گزارش: 2026/09/18</w:t>
       </w:r>
     </w:p>
     <w:sectPr>

</xml_diff>